<commit_message>
Stage 8 review fixes: B-035
</commit_message>
<xml_diff>
--- a/output/archive/Archive/Users/mellerscombe_old_laptop/Handover/Notes/handover_biology_notes_v3.docx
+++ b/output/archive/Archive/Users/mellerscombe_old_laptop/Handover/Notes/handover_biology_notes_v3.docx
@@ -64,7 +64,7 @@
           <w:i/>
           <w:sz w:val="18"/>
         </w:rPr>
-        <w:t>The note is for Leila and Ravi. Anika has seen the first version only.</w:t>
+        <w:t>The note is for Leila and Ravi. Leila has seen the first version only.</w:t>
       </w:r>
     </w:p>
     <w:p>
@@ -78,7 +78,7 @@
     </w:p>
     <w:p>
       <w:r>
-        <w:t>A compound is repeated when its control response falls outside the window on the day it was run. The repeat is run on a fresh sample card, not on the original test lot.</w:t>
+        <w:t>Check run acceptance before interpreting any compound. A failed E-4031 control places the affected run on hold. Investigate the failure and repeat the affected work under the assay protocol; keep the original sample card and test-lot identity linked to the repeat.</w:t>
       </w:r>
     </w:p>
     <w:p>
@@ -88,7 +88,7 @@
         <w:keepLines/>
       </w:pPr>
       <w:r>
-        <w:t>Repeat the whole compound set when the E-4031 reference is outside its window</w:t>
+        <w:t>Hold results from runs that fail the E-4031 acceptance window</w:t>
       </w:r>
     </w:p>
     <w:p>
@@ -98,7 +98,7 @@
         <w:keepLines/>
       </w:pPr>
       <w:r>
-        <w:t>Do not repeat single compounds that fall in a flagged cell; flag them instead</w:t>
+        <w:t>Check cell-quality flags separately; exclude invalid cells under the protocol and repeat when too few accepted cells remain</w:t>
       </w:r>
     </w:p>
     <w:p>
@@ -108,7 +108,7 @@
         <w:keepLines/>
       </w:pPr>
       <w:r>
-        <w:t>Repeats are run at the same concentrations as the first run</w:t>
+        <w:t>Document the repeat conditions and the link to the original run</w:t>
       </w:r>
     </w:p>
     <w:p>
@@ -118,7 +118,7 @@
       </w:pPr>
       <w:commentRangeStart w:id="0"/>
       <w:r>
-        <w:t>Repeat count per compound: [TBC] (I have not agreed this with Gerda and Nikos)</w:t>
+        <w:t>Repeat count per compound: [TBC] (I have not agreed this with Gerda and Ravi)</w:t>
       </w:r>
       <w:commentRangeEnd w:id="0"/>
       <w:r>
@@ -133,7 +133,7 @@
         <w:rPr>
           <w:sz w:val="17"/>
         </w:rPr>
-        <w:t>Where a compound gives a reproducible result in the repeat, the repeat is the one reported. Where the two runs disagree, both are kept on the record and the study director decides.</w:t>
+        <w:t>Retain both original and repeat records. Report accepted results under the protocol, preserving censoring and any qualifications; do not choose a repeat merely because its result is preferred. The study director resolves discordant accepted runs.</w:t>
       </w:r>
     </w:p>
     <w:p>
@@ -147,7 +147,7 @@
     </w:p>
     <w:p>
       <w:r>
-        <w:t>The reference lot change in June needs a bridging check before the screening sets from that month are released. I have not finished the bridging comparison.</w:t>
+        <w:t>The control-lot check is still unresolved. Confirm the lot history and whether a bridging comparison is required before releasing any affected screening sets. I have not closed this review.</w:t>
       </w:r>
     </w:p>
     <w:p>
@@ -157,7 +157,7 @@
         <w:keepLines/>
       </w:pPr>
       <w:r>
-        <w:t>Bridging run on the old and new reference lot, same plate layout</w:t>
+        <w:t>Confirm reference-lot identities and change dates from the control records</w:t>
       </w:r>
     </w:p>
     <w:p>
@@ -167,7 +167,7 @@
         <w:keepLines/>
       </w:pPr>
       <w:r>
-        <w:t>Compare the control IC50 on both lots against the acceptance record</w:t>
+        <w:t>If bridging is required, compare reference responses under matched assay conditions</w:t>
       </w:r>
     </w:p>
     <w:p>
@@ -194,7 +194,7 @@
         <w:keepLines/>
       </w:pPr>
       <w:r>
-        <w:t>Check whether the June screening sets need a note in the biology memo</w:t>
+        <w:t>Identify any affected screening sets and whether a biology memo note is required</w:t>
       </w:r>
     </w:p>
     <w:p>
@@ -203,7 +203,7 @@
           <w:i/>
           <w:sz w:val="18"/>
         </w:rPr>
-        <w:t>DRAFT. The comparison table will go in here once the plate data are back.</w:t>
+        <w:t>DRAFT. Add the source-record references and comparison here once the review is complete.</w:t>
       </w:r>
     </w:p>
     <w:p>
@@ -401,7 +401,7 @@
               <w:rPr>
                 <w:sz w:val="18"/>
               </w:rPr>
-              <w:t>Reference lot bridging</w:t>
+              <w:t>Reference lot review</w:t>
             </w:r>
           </w:p>
         </w:tc>
@@ -433,7 +433,7 @@
               <w:rPr>
                 <w:sz w:val="18"/>
               </w:rPr>
-              <w:t>Run old and new lot on one plate</w:t>
+              <w:t>Confirm lot history and need for bridging</w:t>
             </w:r>
           </w:p>
         </w:tc>
@@ -449,7 +449,7 @@
               <w:rPr>
                 <w:sz w:val="18"/>
               </w:rPr>
-              <w:t>In progress</w:t>
+              <w:t>[TBC]</w:t>
             </w:r>
           </w:p>
         </w:tc>
@@ -499,7 +499,7 @@
               <w:rPr>
                 <w:sz w:val="18"/>
               </w:rPr>
-              <w:t>Check the June run sheets are signed</w:t>
+              <w:t>Check affected run sheets are signed</w:t>
             </w:r>
           </w:p>
         </w:tc>
@@ -549,7 +549,7 @@
               <w:rPr>
                 <w:sz w:val="18"/>
               </w:rPr>
-              <w:t>Jason Scanlon</w:t>
+              <w:t>[TBC]</w:t>
             </w:r>
           </w:p>
         </w:tc>
@@ -668,7 +668,7 @@
         <w:keepLines/>
       </w:pPr>
       <w:r>
-        <w:t>Bridging comparison for the June reference lot</w:t>
+        <w:t>Reference-lot history and any required bridging comparison</w:t>
       </w:r>
     </w:p>
     <w:p>
@@ -678,7 +678,7 @@
         <w:keepLines/>
       </w:pPr>
       <w:r>
-        <w:t>Whether the June sets need a memo note</w:t>
+        <w:t>Whether affected sets need a memo note</w:t>
       </w:r>
     </w:p>
     <w:p>
@@ -696,7 +696,7 @@
           <w:i/>
           <w:sz w:val="18"/>
         </w:rPr>
-        <w:t>I will leave the draft with the group drive folder. Please do not move it until Anika has read section 2.</w:t>
+        <w:t>I will leave the draft in the group drive folder. Please do not move it until Leila has read section 2.</w:t>
       </w:r>
     </w:p>
     <w:sectPr>
@@ -713,7 +713,7 @@
 
 <file path=word/comments.xml><?xml version="1.0" encoding="utf-8"?>
 <w:comments xmlns:a="http://schemas.openxmlformats.org/drawingml/2006/main" xmlns:pic="http://schemas.openxmlformats.org/drawingml/2006/picture" xmlns:r="http://schemas.openxmlformats.org/officeDocument/2006/relationships" xmlns:w="http://schemas.openxmlformats.org/wordprocessingml/2006/main" xmlns:wp="http://schemas.openxmlformats.org/drawingml/2006/wordprocessingDrawing" xmlns:mc="http://schemas.openxmlformats.org/markup-compatibility/2006" xmlns:a14="http://schemas.microsoft.com/office/drawing/2010/main" xmlns:w14="http://schemas.microsoft.com/office/word/2010/wordml" xmlns:wpc="http://schemas.microsoft.com/office/word/2010/wordprocessingCanvas">
-  <w:comment w:id="0" w:author="Reviewer" w:initials="R" w:date="2026-10-08T15:20:04Z">
+  <w:comment w:id="0" w:author="Reviewer" w:initials="R" w:date="2026-10-08T15:26:53Z">
     <w:p>
       <w:pPr>
         <w:pStyle w:val="CommentText"/>
@@ -725,11 +725,11 @@
         <w:annotationRef/>
       </w:r>
       <w:r>
-        <w:t>Do we have a number from the study director or is this still open? Gerda thought two.</w:t>
+        <w:t>Please confirm the repeat limit with the study director and Gerda; still open.</w:t>
       </w:r>
     </w:p>
   </w:comment>
-  <w:comment w:id="1" w:author="Reviewer" w:initials="R" w:date="2026-10-08T15:20:04Z">
+  <w:comment w:id="1" w:author="Reviewer" w:initials="R" w:date="2026-10-08T15:26:53Z">
     <w:p>
       <w:pPr>
         <w:pStyle w:val="CommentText"/>
@@ -741,7 +741,7 @@
         <w:annotationRef/>
       </w:r>
       <w:r>
-        <w:t>Put the plate IDs in here when you have them.</w:t>
+        <w:t>Add the control-lot and run-sheet references once the review is complete.</w:t>
       </w:r>
     </w:p>
   </w:comment>

</xml_diff>